<commit_message>
Update: Dong bo KHBD Tin hoc, Robotics theo TKB lan 4 va cap nhat TKB giao vien
</commit_message>
<xml_diff>
--- a/Hệ thống mẫu văn bản/Nguyên đã làm/Lịch báo giảng/Lịch báo giảng - Tuần 03 (TTH+TH).docx
+++ b/Hệ thống mẫu văn bản/Nguyên đã làm/Lịch báo giảng/Lịch báo giảng - Tuần 03 (TTH+TH).docx
@@ -808,12 +808,6 @@
                 <w:szCs w:val="26"/>
               </w:rPr>
             </w:pPr>
-            <w:r>
-              <w:rPr>
-                <w:rFonts w:ascii="Times New Roman" w:hAnsi="Times New Roman"/>
-                <w:sz w:val="26"/>
-              </w:rPr>
-            </w:r>
           </w:p>
         </w:tc>
         <w:tc>
@@ -835,12 +829,6 @@
                 <w:szCs w:val="26"/>
               </w:rPr>
             </w:pPr>
-            <w:r>
-              <w:rPr>
-                <w:rFonts w:ascii="Times New Roman" w:hAnsi="Times New Roman"/>
-                <w:sz w:val="26"/>
-              </w:rPr>
-            </w:r>
           </w:p>
         </w:tc>
         <w:tc>
@@ -862,12 +850,6 @@
                 <w:szCs w:val="26"/>
               </w:rPr>
             </w:pPr>
-            <w:r>
-              <w:rPr>
-                <w:rFonts w:ascii="Times New Roman" w:hAnsi="Times New Roman"/>
-                <w:sz w:val="26"/>
-              </w:rPr>
-            </w:r>
           </w:p>
         </w:tc>
         <w:tc>
@@ -889,12 +871,6 @@
                 <w:szCs w:val="26"/>
               </w:rPr>
             </w:pPr>
-            <w:r>
-              <w:rPr>
-                <w:rFonts w:ascii="Times New Roman" w:hAnsi="Times New Roman"/>
-                <w:sz w:val="26"/>
-              </w:rPr>
-            </w:r>
           </w:p>
         </w:tc>
         <w:tc>
@@ -916,12 +892,6 @@
                 <w:szCs w:val="26"/>
               </w:rPr>
             </w:pPr>
-            <w:r>
-              <w:rPr>
-                <w:rFonts w:ascii="Times New Roman" w:hAnsi="Times New Roman"/>
-                <w:sz w:val="26"/>
-              </w:rPr>
-            </w:r>
           </w:p>
         </w:tc>
       </w:tr>
@@ -999,12 +969,6 @@
                 <w:szCs w:val="26"/>
               </w:rPr>
             </w:pPr>
-            <w:r>
-              <w:rPr>
-                <w:rFonts w:ascii="Times New Roman" w:hAnsi="Times New Roman"/>
-                <w:sz w:val="26"/>
-              </w:rPr>
-            </w:r>
           </w:p>
         </w:tc>
         <w:tc>
@@ -1026,12 +990,6 @@
                 <w:szCs w:val="26"/>
               </w:rPr>
             </w:pPr>
-            <w:r>
-              <w:rPr>
-                <w:rFonts w:ascii="Times New Roman" w:hAnsi="Times New Roman"/>
-                <w:sz w:val="26"/>
-              </w:rPr>
-            </w:r>
           </w:p>
         </w:tc>
         <w:tc>
@@ -1053,12 +1011,6 @@
                 <w:szCs w:val="26"/>
               </w:rPr>
             </w:pPr>
-            <w:r>
-              <w:rPr>
-                <w:rFonts w:ascii="Times New Roman" w:hAnsi="Times New Roman"/>
-                <w:sz w:val="26"/>
-              </w:rPr>
-            </w:r>
           </w:p>
         </w:tc>
         <w:tc>
@@ -1080,12 +1032,6 @@
                 <w:szCs w:val="26"/>
               </w:rPr>
             </w:pPr>
-            <w:r>
-              <w:rPr>
-                <w:rFonts w:ascii="Times New Roman" w:hAnsi="Times New Roman"/>
-                <w:sz w:val="26"/>
-              </w:rPr>
-            </w:r>
           </w:p>
         </w:tc>
         <w:tc>
@@ -1107,12 +1053,6 @@
                 <w:szCs w:val="26"/>
               </w:rPr>
             </w:pPr>
-            <w:r>
-              <w:rPr>
-                <w:rFonts w:ascii="Times New Roman" w:hAnsi="Times New Roman"/>
-                <w:sz w:val="26"/>
-              </w:rPr>
-            </w:r>
           </w:p>
         </w:tc>
       </w:tr>
@@ -1190,12 +1130,6 @@
                 <w:szCs w:val="26"/>
               </w:rPr>
             </w:pPr>
-            <w:r>
-              <w:rPr>
-                <w:rFonts w:ascii="Times New Roman" w:hAnsi="Times New Roman"/>
-                <w:sz w:val="26"/>
-              </w:rPr>
-            </w:r>
           </w:p>
         </w:tc>
         <w:tc>
@@ -1217,12 +1151,6 @@
                 <w:szCs w:val="26"/>
               </w:rPr>
             </w:pPr>
-            <w:r>
-              <w:rPr>
-                <w:rFonts w:ascii="Times New Roman" w:hAnsi="Times New Roman"/>
-                <w:sz w:val="26"/>
-              </w:rPr>
-            </w:r>
           </w:p>
         </w:tc>
         <w:tc>
@@ -1244,12 +1172,6 @@
                 <w:szCs w:val="26"/>
               </w:rPr>
             </w:pPr>
-            <w:r>
-              <w:rPr>
-                <w:rFonts w:ascii="Times New Roman" w:hAnsi="Times New Roman"/>
-                <w:sz w:val="26"/>
-              </w:rPr>
-            </w:r>
           </w:p>
         </w:tc>
         <w:tc>
@@ -1271,12 +1193,6 @@
                 <w:szCs w:val="26"/>
               </w:rPr>
             </w:pPr>
-            <w:r>
-              <w:rPr>
-                <w:rFonts w:ascii="Times New Roman" w:hAnsi="Times New Roman"/>
-                <w:sz w:val="26"/>
-              </w:rPr>
-            </w:r>
           </w:p>
         </w:tc>
         <w:tc>
@@ -1298,12 +1214,6 @@
                 <w:szCs w:val="26"/>
               </w:rPr>
             </w:pPr>
-            <w:r>
-              <w:rPr>
-                <w:rFonts w:ascii="Times New Roman" w:hAnsi="Times New Roman"/>
-                <w:sz w:val="26"/>
-              </w:rPr>
-            </w:r>
           </w:p>
         </w:tc>
       </w:tr>
@@ -1582,12 +1492,6 @@
                 <w:szCs w:val="26"/>
               </w:rPr>
             </w:pPr>
-            <w:r>
-              <w:rPr>
-                <w:rFonts w:ascii="Times New Roman" w:hAnsi="Times New Roman"/>
-                <w:sz w:val="26"/>
-              </w:rPr>
-            </w:r>
           </w:p>
         </w:tc>
         <w:tc>
@@ -1609,12 +1513,6 @@
                 <w:szCs w:val="26"/>
               </w:rPr>
             </w:pPr>
-            <w:r>
-              <w:rPr>
-                <w:rFonts w:ascii="Times New Roman" w:hAnsi="Times New Roman"/>
-                <w:sz w:val="26"/>
-              </w:rPr>
-            </w:r>
           </w:p>
         </w:tc>
         <w:tc>
@@ -1636,12 +1534,6 @@
                 <w:szCs w:val="26"/>
               </w:rPr>
             </w:pPr>
-            <w:r>
-              <w:rPr>
-                <w:rFonts w:ascii="Times New Roman" w:hAnsi="Times New Roman"/>
-                <w:sz w:val="26"/>
-              </w:rPr>
-            </w:r>
           </w:p>
         </w:tc>
         <w:tc>
@@ -1663,12 +1555,6 @@
                 <w:szCs w:val="26"/>
               </w:rPr>
             </w:pPr>
-            <w:r>
-              <w:rPr>
-                <w:rFonts w:ascii="Times New Roman" w:hAnsi="Times New Roman"/>
-                <w:sz w:val="26"/>
-              </w:rPr>
-            </w:r>
           </w:p>
         </w:tc>
         <w:tc>
@@ -1690,12 +1576,6 @@
                 <w:szCs w:val="26"/>
               </w:rPr>
             </w:pPr>
-            <w:r>
-              <w:rPr>
-                <w:rFonts w:ascii="Times New Roman" w:hAnsi="Times New Roman"/>
-                <w:sz w:val="26"/>
-              </w:rPr>
-            </w:r>
           </w:p>
         </w:tc>
       </w:tr>
@@ -1977,12 +1857,6 @@
                 <w:szCs w:val="26"/>
               </w:rPr>
             </w:pPr>
-            <w:r>
-              <w:rPr>
-                <w:rFonts w:ascii="Times New Roman" w:hAnsi="Times New Roman"/>
-                <w:sz w:val="26"/>
-              </w:rPr>
-            </w:r>
           </w:p>
         </w:tc>
         <w:tc>
@@ -2004,12 +1878,6 @@
                 <w:szCs w:val="26"/>
               </w:rPr>
             </w:pPr>
-            <w:r>
-              <w:rPr>
-                <w:rFonts w:ascii="Times New Roman" w:hAnsi="Times New Roman"/>
-                <w:sz w:val="26"/>
-              </w:rPr>
-            </w:r>
           </w:p>
         </w:tc>
         <w:tc>
@@ -2031,12 +1899,6 @@
                 <w:szCs w:val="26"/>
               </w:rPr>
             </w:pPr>
-            <w:r>
-              <w:rPr>
-                <w:rFonts w:ascii="Times New Roman" w:hAnsi="Times New Roman"/>
-                <w:sz w:val="26"/>
-              </w:rPr>
-            </w:r>
           </w:p>
         </w:tc>
         <w:tc>
@@ -2058,12 +1920,6 @@
                 <w:szCs w:val="26"/>
               </w:rPr>
             </w:pPr>
-            <w:r>
-              <w:rPr>
-                <w:rFonts w:ascii="Times New Roman" w:hAnsi="Times New Roman"/>
-                <w:sz w:val="26"/>
-              </w:rPr>
-            </w:r>
           </w:p>
         </w:tc>
         <w:tc>
@@ -2085,12 +1941,6 @@
                 <w:szCs w:val="26"/>
               </w:rPr>
             </w:pPr>
-            <w:r>
-              <w:rPr>
-                <w:rFonts w:ascii="Times New Roman" w:hAnsi="Times New Roman"/>
-                <w:sz w:val="26"/>
-              </w:rPr>
-            </w:r>
           </w:p>
         </w:tc>
       </w:tr>
@@ -2576,12 +2426,6 @@
                 <w:szCs w:val="26"/>
               </w:rPr>
             </w:pPr>
-            <w:r>
-              <w:rPr>
-                <w:rFonts w:ascii="Times New Roman" w:hAnsi="Times New Roman"/>
-                <w:sz w:val="26"/>
-              </w:rPr>
-            </w:r>
           </w:p>
         </w:tc>
         <w:tc>
@@ -2603,12 +2447,6 @@
                 <w:szCs w:val="26"/>
               </w:rPr>
             </w:pPr>
-            <w:r>
-              <w:rPr>
-                <w:rFonts w:ascii="Times New Roman" w:hAnsi="Times New Roman"/>
-                <w:sz w:val="26"/>
-              </w:rPr>
-            </w:r>
           </w:p>
         </w:tc>
         <w:tc>
@@ -2630,12 +2468,6 @@
                 <w:szCs w:val="26"/>
               </w:rPr>
             </w:pPr>
-            <w:r>
-              <w:rPr>
-                <w:rFonts w:ascii="Times New Roman" w:hAnsi="Times New Roman"/>
-                <w:sz w:val="26"/>
-              </w:rPr>
-            </w:r>
           </w:p>
         </w:tc>
         <w:tc>
@@ -2657,12 +2489,6 @@
                 <w:szCs w:val="26"/>
               </w:rPr>
             </w:pPr>
-            <w:r>
-              <w:rPr>
-                <w:rFonts w:ascii="Times New Roman" w:hAnsi="Times New Roman"/>
-                <w:sz w:val="26"/>
-              </w:rPr>
-            </w:r>
           </w:p>
         </w:tc>
         <w:tc>
@@ -2684,12 +2510,6 @@
                 <w:szCs w:val="26"/>
               </w:rPr>
             </w:pPr>
-            <w:r>
-              <w:rPr>
-                <w:rFonts w:ascii="Times New Roman" w:hAnsi="Times New Roman"/>
-                <w:sz w:val="26"/>
-              </w:rPr>
-            </w:r>
           </w:p>
         </w:tc>
       </w:tr>
@@ -2773,12 +2593,6 @@
                 <w:szCs w:val="26"/>
               </w:rPr>
             </w:pPr>
-            <w:r>
-              <w:rPr>
-                <w:rFonts w:ascii="Times New Roman" w:hAnsi="Times New Roman"/>
-                <w:sz w:val="26"/>
-              </w:rPr>
-            </w:r>
           </w:p>
         </w:tc>
         <w:tc>
@@ -2800,12 +2614,6 @@
                 <w:szCs w:val="26"/>
               </w:rPr>
             </w:pPr>
-            <w:r>
-              <w:rPr>
-                <w:rFonts w:ascii="Times New Roman" w:hAnsi="Times New Roman"/>
-                <w:sz w:val="26"/>
-              </w:rPr>
-            </w:r>
           </w:p>
         </w:tc>
         <w:tc>
@@ -2827,12 +2635,6 @@
                 <w:szCs w:val="26"/>
               </w:rPr>
             </w:pPr>
-            <w:r>
-              <w:rPr>
-                <w:rFonts w:ascii="Times New Roman" w:hAnsi="Times New Roman"/>
-                <w:sz w:val="26"/>
-              </w:rPr>
-            </w:r>
           </w:p>
         </w:tc>
         <w:tc>
@@ -2854,12 +2656,6 @@
                 <w:szCs w:val="26"/>
               </w:rPr>
             </w:pPr>
-            <w:r>
-              <w:rPr>
-                <w:rFonts w:ascii="Times New Roman" w:hAnsi="Times New Roman"/>
-                <w:sz w:val="26"/>
-              </w:rPr>
-            </w:r>
           </w:p>
         </w:tc>
         <w:tc>
@@ -2881,12 +2677,6 @@
                 <w:szCs w:val="26"/>
               </w:rPr>
             </w:pPr>
-            <w:r>
-              <w:rPr>
-                <w:rFonts w:ascii="Times New Roman" w:hAnsi="Times New Roman"/>
-                <w:sz w:val="26"/>
-              </w:rPr>
-            </w:r>
           </w:p>
         </w:tc>
       </w:tr>
@@ -3169,12 +2959,6 @@
                 <w:szCs w:val="26"/>
               </w:rPr>
             </w:pPr>
-            <w:r>
-              <w:rPr>
-                <w:rFonts w:ascii="Times New Roman" w:hAnsi="Times New Roman"/>
-                <w:sz w:val="26"/>
-              </w:rPr>
-            </w:r>
           </w:p>
         </w:tc>
         <w:tc>
@@ -3196,12 +2980,6 @@
                 <w:szCs w:val="26"/>
               </w:rPr>
             </w:pPr>
-            <w:r>
-              <w:rPr>
-                <w:rFonts w:ascii="Times New Roman" w:hAnsi="Times New Roman"/>
-                <w:sz w:val="26"/>
-              </w:rPr>
-            </w:r>
           </w:p>
         </w:tc>
         <w:tc>
@@ -3223,12 +3001,6 @@
                 <w:szCs w:val="26"/>
               </w:rPr>
             </w:pPr>
-            <w:r>
-              <w:rPr>
-                <w:rFonts w:ascii="Times New Roman" w:hAnsi="Times New Roman"/>
-                <w:sz w:val="26"/>
-              </w:rPr>
-            </w:r>
           </w:p>
         </w:tc>
         <w:tc>
@@ -3250,12 +3022,6 @@
                 <w:szCs w:val="26"/>
               </w:rPr>
             </w:pPr>
-            <w:r>
-              <w:rPr>
-                <w:rFonts w:ascii="Times New Roman" w:hAnsi="Times New Roman"/>
-                <w:sz w:val="26"/>
-              </w:rPr>
-            </w:r>
           </w:p>
         </w:tc>
         <w:tc>
@@ -3277,12 +3043,6 @@
                 <w:szCs w:val="26"/>
               </w:rPr>
             </w:pPr>
-            <w:r>
-              <w:rPr>
-                <w:rFonts w:ascii="Times New Roman" w:hAnsi="Times New Roman"/>
-                <w:sz w:val="26"/>
-              </w:rPr>
-            </w:r>
           </w:p>
         </w:tc>
       </w:tr>
@@ -3565,12 +3325,6 @@
                 <w:szCs w:val="26"/>
               </w:rPr>
             </w:pPr>
-            <w:r>
-              <w:rPr>
-                <w:rFonts w:ascii="Times New Roman" w:hAnsi="Times New Roman"/>
-                <w:sz w:val="26"/>
-              </w:rPr>
-            </w:r>
           </w:p>
         </w:tc>
         <w:tc>
@@ -3592,12 +3346,6 @@
                 <w:szCs w:val="26"/>
               </w:rPr>
             </w:pPr>
-            <w:r>
-              <w:rPr>
-                <w:rFonts w:ascii="Times New Roman" w:hAnsi="Times New Roman"/>
-                <w:sz w:val="26"/>
-              </w:rPr>
-            </w:r>
           </w:p>
         </w:tc>
         <w:tc>
@@ -3619,12 +3367,6 @@
                 <w:szCs w:val="26"/>
               </w:rPr>
             </w:pPr>
-            <w:r>
-              <w:rPr>
-                <w:rFonts w:ascii="Times New Roman" w:hAnsi="Times New Roman"/>
-                <w:sz w:val="26"/>
-              </w:rPr>
-            </w:r>
           </w:p>
         </w:tc>
         <w:tc>
@@ -3646,12 +3388,6 @@
                 <w:szCs w:val="26"/>
               </w:rPr>
             </w:pPr>
-            <w:r>
-              <w:rPr>
-                <w:rFonts w:ascii="Times New Roman" w:hAnsi="Times New Roman"/>
-                <w:sz w:val="26"/>
-              </w:rPr>
-            </w:r>
           </w:p>
         </w:tc>
         <w:tc>
@@ -3673,12 +3409,6 @@
                 <w:szCs w:val="26"/>
               </w:rPr>
             </w:pPr>
-            <w:r>
-              <w:rPr>
-                <w:rFonts w:ascii="Times New Roman" w:hAnsi="Times New Roman"/>
-                <w:sz w:val="26"/>
-              </w:rPr>
-            </w:r>
           </w:p>
         </w:tc>
       </w:tr>
@@ -4168,12 +3898,6 @@
                 <w:szCs w:val="26"/>
               </w:rPr>
             </w:pPr>
-            <w:r>
-              <w:rPr>
-                <w:rFonts w:ascii="Times New Roman" w:hAnsi="Times New Roman"/>
-                <w:sz w:val="26"/>
-              </w:rPr>
-            </w:r>
           </w:p>
         </w:tc>
         <w:tc>
@@ -4195,12 +3919,6 @@
                 <w:szCs w:val="26"/>
               </w:rPr>
             </w:pPr>
-            <w:r>
-              <w:rPr>
-                <w:rFonts w:ascii="Times New Roman" w:hAnsi="Times New Roman"/>
-                <w:sz w:val="26"/>
-              </w:rPr>
-            </w:r>
           </w:p>
         </w:tc>
         <w:tc>
@@ -4222,12 +3940,6 @@
                 <w:szCs w:val="26"/>
               </w:rPr>
             </w:pPr>
-            <w:r>
-              <w:rPr>
-                <w:rFonts w:ascii="Times New Roman" w:hAnsi="Times New Roman"/>
-                <w:sz w:val="26"/>
-              </w:rPr>
-            </w:r>
           </w:p>
         </w:tc>
         <w:tc>
@@ -4249,12 +3961,6 @@
                 <w:szCs w:val="26"/>
               </w:rPr>
             </w:pPr>
-            <w:r>
-              <w:rPr>
-                <w:rFonts w:ascii="Times New Roman" w:hAnsi="Times New Roman"/>
-                <w:sz w:val="26"/>
-              </w:rPr>
-            </w:r>
           </w:p>
         </w:tc>
         <w:tc>
@@ -4276,12 +3982,6 @@
                 <w:szCs w:val="26"/>
               </w:rPr>
             </w:pPr>
-            <w:r>
-              <w:rPr>
-                <w:rFonts w:ascii="Times New Roman" w:hAnsi="Times New Roman"/>
-                <w:sz w:val="26"/>
-              </w:rPr>
-            </w:r>
           </w:p>
         </w:tc>
       </w:tr>
@@ -4564,12 +4264,6 @@
                 <w:szCs w:val="26"/>
               </w:rPr>
             </w:pPr>
-            <w:r>
-              <w:rPr>
-                <w:rFonts w:ascii="Times New Roman" w:hAnsi="Times New Roman"/>
-                <w:sz w:val="26"/>
-              </w:rPr>
-            </w:r>
           </w:p>
         </w:tc>
         <w:tc>
@@ -4591,12 +4285,6 @@
                 <w:szCs w:val="26"/>
               </w:rPr>
             </w:pPr>
-            <w:r>
-              <w:rPr>
-                <w:rFonts w:ascii="Times New Roman" w:hAnsi="Times New Roman"/>
-                <w:sz w:val="26"/>
-              </w:rPr>
-            </w:r>
           </w:p>
         </w:tc>
         <w:tc>
@@ -4618,12 +4306,6 @@
                 <w:szCs w:val="26"/>
               </w:rPr>
             </w:pPr>
-            <w:r>
-              <w:rPr>
-                <w:rFonts w:ascii="Times New Roman" w:hAnsi="Times New Roman"/>
-                <w:sz w:val="26"/>
-              </w:rPr>
-            </w:r>
           </w:p>
         </w:tc>
         <w:tc>
@@ -4645,12 +4327,6 @@
                 <w:szCs w:val="26"/>
               </w:rPr>
             </w:pPr>
-            <w:r>
-              <w:rPr>
-                <w:rFonts w:ascii="Times New Roman" w:hAnsi="Times New Roman"/>
-                <w:sz w:val="26"/>
-              </w:rPr>
-            </w:r>
           </w:p>
         </w:tc>
         <w:tc>
@@ -4672,12 +4348,6 @@
                 <w:szCs w:val="26"/>
               </w:rPr>
             </w:pPr>
-            <w:r>
-              <w:rPr>
-                <w:rFonts w:ascii="Times New Roman" w:hAnsi="Times New Roman"/>
-                <w:sz w:val="26"/>
-              </w:rPr>
-            </w:r>
           </w:p>
         </w:tc>
       </w:tr>
@@ -4956,13 +4626,6 @@
                 <w:szCs w:val="26"/>
               </w:rPr>
             </w:pPr>
-            <w:r>
-              <w:rPr>
-                <w:rFonts w:ascii="Times New Roman" w:hAnsi="Times New Roman" w:cs="Times New Roman"/>
-                <w:sz w:val="26"/>
-                <w:szCs w:val="26"/>
-              </w:rPr>
-            </w:r>
           </w:p>
         </w:tc>
         <w:tc>
@@ -4984,13 +4647,6 @@
                 <w:szCs w:val="26"/>
               </w:rPr>
             </w:pPr>
-            <w:r>
-              <w:rPr>
-                <w:rFonts w:ascii="Times New Roman" w:hAnsi="Times New Roman" w:cs="Times New Roman"/>
-                <w:sz w:val="26"/>
-                <w:szCs w:val="26"/>
-              </w:rPr>
-            </w:r>
           </w:p>
         </w:tc>
         <w:tc>
@@ -5012,13 +4668,6 @@
                 <w:szCs w:val="26"/>
               </w:rPr>
             </w:pPr>
-            <w:r>
-              <w:rPr>
-                <w:rFonts w:ascii="Times New Roman" w:hAnsi="Times New Roman" w:cs="Times New Roman"/>
-                <w:sz w:val="26"/>
-                <w:szCs w:val="26"/>
-              </w:rPr>
-            </w:r>
           </w:p>
         </w:tc>
         <w:tc>
@@ -5040,13 +4689,6 @@
                 <w:szCs w:val="26"/>
               </w:rPr>
             </w:pPr>
-            <w:r>
-              <w:rPr>
-                <w:rFonts w:ascii="Times New Roman" w:hAnsi="Times New Roman" w:cs="Times New Roman"/>
-                <w:sz w:val="26"/>
-                <w:szCs w:val="26"/>
-              </w:rPr>
-            </w:r>
           </w:p>
         </w:tc>
         <w:tc>
@@ -5068,13 +4710,6 @@
                 <w:szCs w:val="26"/>
               </w:rPr>
             </w:pPr>
-            <w:r>
-              <w:rPr>
-                <w:rFonts w:ascii="Times New Roman" w:hAnsi="Times New Roman" w:cs="Times New Roman"/>
-                <w:sz w:val="26"/>
-                <w:szCs w:val="26"/>
-              </w:rPr>
-            </w:r>
           </w:p>
         </w:tc>
       </w:tr>
@@ -5151,13 +4786,6 @@
                 <w:szCs w:val="26"/>
               </w:rPr>
             </w:pPr>
-            <w:r>
-              <w:rPr>
-                <w:rFonts w:ascii="Times New Roman" w:hAnsi="Times New Roman" w:cs="Times New Roman"/>
-                <w:sz w:val="26"/>
-                <w:szCs w:val="26"/>
-              </w:rPr>
-            </w:r>
           </w:p>
         </w:tc>
         <w:tc>
@@ -5179,13 +4807,6 @@
                 <w:szCs w:val="26"/>
               </w:rPr>
             </w:pPr>
-            <w:r>
-              <w:rPr>
-                <w:rFonts w:ascii="Times New Roman" w:hAnsi="Times New Roman" w:cs="Times New Roman"/>
-                <w:sz w:val="26"/>
-                <w:szCs w:val="26"/>
-              </w:rPr>
-            </w:r>
           </w:p>
         </w:tc>
         <w:tc>
@@ -5207,13 +4828,6 @@
                 <w:szCs w:val="26"/>
               </w:rPr>
             </w:pPr>
-            <w:r>
-              <w:rPr>
-                <w:rFonts w:ascii="Times New Roman" w:hAnsi="Times New Roman" w:cs="Times New Roman"/>
-                <w:sz w:val="26"/>
-                <w:szCs w:val="26"/>
-              </w:rPr>
-            </w:r>
           </w:p>
         </w:tc>
         <w:tc>
@@ -5235,13 +4849,6 @@
                 <w:szCs w:val="26"/>
               </w:rPr>
             </w:pPr>
-            <w:r>
-              <w:rPr>
-                <w:rFonts w:ascii="Times New Roman" w:hAnsi="Times New Roman" w:cs="Times New Roman"/>
-                <w:sz w:val="26"/>
-                <w:szCs w:val="26"/>
-              </w:rPr>
-            </w:r>
           </w:p>
         </w:tc>
         <w:tc>
@@ -5263,13 +4870,6 @@
                 <w:szCs w:val="26"/>
               </w:rPr>
             </w:pPr>
-            <w:r>
-              <w:rPr>
-                <w:rFonts w:ascii="Times New Roman" w:hAnsi="Times New Roman" w:cs="Times New Roman"/>
-                <w:sz w:val="26"/>
-                <w:szCs w:val="26"/>
-              </w:rPr>
-            </w:r>
           </w:p>
         </w:tc>
       </w:tr>
@@ -5346,13 +4946,6 @@
                 <w:szCs w:val="26"/>
               </w:rPr>
             </w:pPr>
-            <w:r>
-              <w:rPr>
-                <w:rFonts w:ascii="Times New Roman" w:hAnsi="Times New Roman" w:cs="Times New Roman"/>
-                <w:sz w:val="26"/>
-                <w:szCs w:val="26"/>
-              </w:rPr>
-            </w:r>
           </w:p>
         </w:tc>
         <w:tc>
@@ -5374,13 +4967,6 @@
                 <w:szCs w:val="26"/>
               </w:rPr>
             </w:pPr>
-            <w:r>
-              <w:rPr>
-                <w:rFonts w:ascii="Times New Roman" w:hAnsi="Times New Roman" w:cs="Times New Roman"/>
-                <w:sz w:val="26"/>
-                <w:szCs w:val="26"/>
-              </w:rPr>
-            </w:r>
           </w:p>
         </w:tc>
         <w:tc>
@@ -5402,13 +4988,6 @@
                 <w:szCs w:val="26"/>
               </w:rPr>
             </w:pPr>
-            <w:r>
-              <w:rPr>
-                <w:rFonts w:ascii="Times New Roman" w:hAnsi="Times New Roman" w:cs="Times New Roman"/>
-                <w:sz w:val="26"/>
-                <w:szCs w:val="26"/>
-              </w:rPr>
-            </w:r>
           </w:p>
         </w:tc>
         <w:tc>
@@ -5430,13 +5009,6 @@
                 <w:szCs w:val="26"/>
               </w:rPr>
             </w:pPr>
-            <w:r>
-              <w:rPr>
-                <w:rFonts w:ascii="Times New Roman" w:hAnsi="Times New Roman" w:cs="Times New Roman"/>
-                <w:sz w:val="26"/>
-                <w:szCs w:val="26"/>
-              </w:rPr>
-            </w:r>
           </w:p>
         </w:tc>
         <w:tc>
@@ -5458,13 +5030,6 @@
                 <w:szCs w:val="26"/>
               </w:rPr>
             </w:pPr>
-            <w:r>
-              <w:rPr>
-                <w:rFonts w:ascii="Times New Roman" w:hAnsi="Times New Roman" w:cs="Times New Roman"/>
-                <w:sz w:val="26"/>
-                <w:szCs w:val="26"/>
-              </w:rPr>
-            </w:r>
           </w:p>
         </w:tc>
       </w:tr>
@@ -5541,13 +5106,6 @@
                 <w:szCs w:val="26"/>
               </w:rPr>
             </w:pPr>
-            <w:r>
-              <w:rPr>
-                <w:rFonts w:ascii="Times New Roman" w:hAnsi="Times New Roman" w:cs="Times New Roman"/>
-                <w:sz w:val="26"/>
-                <w:szCs w:val="26"/>
-              </w:rPr>
-            </w:r>
           </w:p>
         </w:tc>
         <w:tc>
@@ -5569,13 +5127,6 @@
                 <w:szCs w:val="26"/>
               </w:rPr>
             </w:pPr>
-            <w:r>
-              <w:rPr>
-                <w:rFonts w:ascii="Times New Roman" w:hAnsi="Times New Roman" w:cs="Times New Roman"/>
-                <w:sz w:val="26"/>
-                <w:szCs w:val="26"/>
-              </w:rPr>
-            </w:r>
           </w:p>
         </w:tc>
         <w:tc>
@@ -5597,13 +5148,6 @@
                 <w:szCs w:val="26"/>
               </w:rPr>
             </w:pPr>
-            <w:r>
-              <w:rPr>
-                <w:rFonts w:ascii="Times New Roman" w:hAnsi="Times New Roman" w:cs="Times New Roman"/>
-                <w:sz w:val="26"/>
-                <w:szCs w:val="26"/>
-              </w:rPr>
-            </w:r>
           </w:p>
         </w:tc>
         <w:tc>
@@ -5625,13 +5169,6 @@
                 <w:szCs w:val="26"/>
               </w:rPr>
             </w:pPr>
-            <w:r>
-              <w:rPr>
-                <w:rFonts w:ascii="Times New Roman" w:hAnsi="Times New Roman" w:cs="Times New Roman"/>
-                <w:sz w:val="26"/>
-                <w:szCs w:val="26"/>
-              </w:rPr>
-            </w:r>
           </w:p>
         </w:tc>
         <w:tc>
@@ -5653,13 +5190,6 @@
                 <w:szCs w:val="26"/>
               </w:rPr>
             </w:pPr>
-            <w:r>
-              <w:rPr>
-                <w:rFonts w:ascii="Times New Roman" w:hAnsi="Times New Roman" w:cs="Times New Roman"/>
-                <w:sz w:val="26"/>
-                <w:szCs w:val="26"/>
-              </w:rPr>
-            </w:r>
           </w:p>
         </w:tc>
       </w:tr>
@@ -5808,11 +5338,6 @@
       </w:tr>
     </w:tbl>
     <w:p>
-      <w:r>
-        <w:br w:type="page"/>
-      </w:r>
-    </w:p>
-    <w:p>
       <w:pPr>
         <w:spacing w:after="0" w:line="240" w:lineRule="auto"/>
         <w:rPr>
@@ -5823,6 +5348,7 @@
         <w:rPr>
           <w:i/>
         </w:rPr>
+        <w:lastRenderedPageBreak/>
         <w:t>Buổi…chiều…..Tuần…03…(Từ ngày…17/08/2026…đến ngày:… 21/08/2026….)</w:t>
       </w:r>
     </w:p>
@@ -6181,12 +5707,6 @@
                 <w:szCs w:val="26"/>
               </w:rPr>
             </w:pPr>
-            <w:r>
-              <w:rPr>
-                <w:rFonts w:ascii="Times New Roman" w:hAnsi="Times New Roman"/>
-                <w:sz w:val="26"/>
-              </w:rPr>
-            </w:r>
           </w:p>
         </w:tc>
         <w:tc>
@@ -6208,12 +5728,6 @@
                 <w:szCs w:val="26"/>
               </w:rPr>
             </w:pPr>
-            <w:r>
-              <w:rPr>
-                <w:rFonts w:ascii="Times New Roman" w:hAnsi="Times New Roman"/>
-                <w:sz w:val="26"/>
-              </w:rPr>
-            </w:r>
           </w:p>
         </w:tc>
         <w:tc>
@@ -6235,12 +5749,6 @@
                 <w:szCs w:val="26"/>
               </w:rPr>
             </w:pPr>
-            <w:r>
-              <w:rPr>
-                <w:rFonts w:ascii="Times New Roman" w:hAnsi="Times New Roman"/>
-                <w:sz w:val="26"/>
-              </w:rPr>
-            </w:r>
           </w:p>
         </w:tc>
         <w:tc>
@@ -6262,12 +5770,6 @@
                 <w:szCs w:val="26"/>
               </w:rPr>
             </w:pPr>
-            <w:r>
-              <w:rPr>
-                <w:rFonts w:ascii="Times New Roman" w:hAnsi="Times New Roman"/>
-                <w:sz w:val="26"/>
-              </w:rPr>
-            </w:r>
           </w:p>
         </w:tc>
         <w:tc>
@@ -6289,12 +5791,6 @@
                 <w:szCs w:val="26"/>
               </w:rPr>
             </w:pPr>
-            <w:r>
-              <w:rPr>
-                <w:rFonts w:ascii="Times New Roman" w:hAnsi="Times New Roman"/>
-                <w:sz w:val="26"/>
-              </w:rPr>
-            </w:r>
           </w:p>
         </w:tc>
       </w:tr>
@@ -6372,12 +5868,6 @@
                 <w:szCs w:val="26"/>
               </w:rPr>
             </w:pPr>
-            <w:r>
-              <w:rPr>
-                <w:rFonts w:ascii="Times New Roman" w:hAnsi="Times New Roman"/>
-                <w:sz w:val="26"/>
-              </w:rPr>
-            </w:r>
           </w:p>
         </w:tc>
         <w:tc>
@@ -6399,12 +5889,6 @@
                 <w:szCs w:val="26"/>
               </w:rPr>
             </w:pPr>
-            <w:r>
-              <w:rPr>
-                <w:rFonts w:ascii="Times New Roman" w:hAnsi="Times New Roman"/>
-                <w:sz w:val="26"/>
-              </w:rPr>
-            </w:r>
           </w:p>
         </w:tc>
         <w:tc>
@@ -6426,12 +5910,6 @@
                 <w:szCs w:val="26"/>
               </w:rPr>
             </w:pPr>
-            <w:r>
-              <w:rPr>
-                <w:rFonts w:ascii="Times New Roman" w:hAnsi="Times New Roman"/>
-                <w:sz w:val="26"/>
-              </w:rPr>
-            </w:r>
           </w:p>
         </w:tc>
         <w:tc>
@@ -6453,12 +5931,6 @@
                 <w:szCs w:val="26"/>
               </w:rPr>
             </w:pPr>
-            <w:r>
-              <w:rPr>
-                <w:rFonts w:ascii="Times New Roman" w:hAnsi="Times New Roman"/>
-                <w:sz w:val="26"/>
-              </w:rPr>
-            </w:r>
           </w:p>
         </w:tc>
         <w:tc>
@@ -6480,12 +5952,6 @@
                 <w:szCs w:val="26"/>
               </w:rPr>
             </w:pPr>
-            <w:r>
-              <w:rPr>
-                <w:rFonts w:ascii="Times New Roman" w:hAnsi="Times New Roman"/>
-                <w:sz w:val="26"/>
-              </w:rPr>
-            </w:r>
           </w:p>
         </w:tc>
       </w:tr>
@@ -6759,12 +6225,6 @@
                 <w:szCs w:val="26"/>
               </w:rPr>
             </w:pPr>
-            <w:r>
-              <w:rPr>
-                <w:rFonts w:ascii="Times New Roman" w:hAnsi="Times New Roman"/>
-                <w:sz w:val="26"/>
-              </w:rPr>
-            </w:r>
           </w:p>
         </w:tc>
         <w:tc>
@@ -6786,12 +6246,6 @@
                 <w:szCs w:val="26"/>
               </w:rPr>
             </w:pPr>
-            <w:r>
-              <w:rPr>
-                <w:rFonts w:ascii="Times New Roman" w:hAnsi="Times New Roman"/>
-                <w:sz w:val="26"/>
-              </w:rPr>
-            </w:r>
           </w:p>
         </w:tc>
         <w:tc>
@@ -6813,12 +6267,6 @@
                 <w:szCs w:val="26"/>
               </w:rPr>
             </w:pPr>
-            <w:r>
-              <w:rPr>
-                <w:rFonts w:ascii="Times New Roman" w:hAnsi="Times New Roman"/>
-                <w:sz w:val="26"/>
-              </w:rPr>
-            </w:r>
           </w:p>
         </w:tc>
         <w:tc>
@@ -6840,12 +6288,6 @@
                 <w:szCs w:val="26"/>
               </w:rPr>
             </w:pPr>
-            <w:r>
-              <w:rPr>
-                <w:rFonts w:ascii="Times New Roman" w:hAnsi="Times New Roman"/>
-                <w:sz w:val="26"/>
-              </w:rPr>
-            </w:r>
           </w:p>
         </w:tc>
         <w:tc>
@@ -6867,12 +6309,6 @@
                 <w:szCs w:val="26"/>
               </w:rPr>
             </w:pPr>
-            <w:r>
-              <w:rPr>
-                <w:rFonts w:ascii="Times New Roman" w:hAnsi="Times New Roman"/>
-                <w:sz w:val="26"/>
-              </w:rPr>
-            </w:r>
           </w:p>
         </w:tc>
       </w:tr>
@@ -6950,12 +6386,6 @@
                 <w:szCs w:val="26"/>
               </w:rPr>
             </w:pPr>
-            <w:r>
-              <w:rPr>
-                <w:rFonts w:ascii="Times New Roman" w:hAnsi="Times New Roman"/>
-                <w:sz w:val="26"/>
-              </w:rPr>
-            </w:r>
           </w:p>
         </w:tc>
         <w:tc>
@@ -6977,12 +6407,6 @@
                 <w:szCs w:val="26"/>
               </w:rPr>
             </w:pPr>
-            <w:r>
-              <w:rPr>
-                <w:rFonts w:ascii="Times New Roman" w:hAnsi="Times New Roman"/>
-                <w:sz w:val="26"/>
-              </w:rPr>
-            </w:r>
           </w:p>
         </w:tc>
         <w:tc>
@@ -7004,12 +6428,6 @@
                 <w:szCs w:val="26"/>
               </w:rPr>
             </w:pPr>
-            <w:r>
-              <w:rPr>
-                <w:rFonts w:ascii="Times New Roman" w:hAnsi="Times New Roman"/>
-                <w:sz w:val="26"/>
-              </w:rPr>
-            </w:r>
           </w:p>
         </w:tc>
         <w:tc>
@@ -7031,12 +6449,6 @@
                 <w:szCs w:val="26"/>
               </w:rPr>
             </w:pPr>
-            <w:r>
-              <w:rPr>
-                <w:rFonts w:ascii="Times New Roman" w:hAnsi="Times New Roman"/>
-                <w:sz w:val="26"/>
-              </w:rPr>
-            </w:r>
           </w:p>
         </w:tc>
         <w:tc>
@@ -7058,12 +6470,6 @@
                 <w:szCs w:val="26"/>
               </w:rPr>
             </w:pPr>
-            <w:r>
-              <w:rPr>
-                <w:rFonts w:ascii="Times New Roman" w:hAnsi="Times New Roman"/>
-                <w:sz w:val="26"/>
-              </w:rPr>
-            </w:r>
           </w:p>
         </w:tc>
       </w:tr>
@@ -7350,13 +6756,6 @@
                 <w:szCs w:val="26"/>
               </w:rPr>
             </w:pPr>
-            <w:r>
-              <w:rPr>
-                <w:rFonts w:ascii="Times New Roman" w:hAnsi="Times New Roman" w:cs="Times New Roman"/>
-                <w:sz w:val="26"/>
-                <w:szCs w:val="26"/>
-              </w:rPr>
-            </w:r>
           </w:p>
         </w:tc>
         <w:tc>
@@ -7378,13 +6777,6 @@
                 <w:szCs w:val="26"/>
               </w:rPr>
             </w:pPr>
-            <w:r>
-              <w:rPr>
-                <w:rFonts w:ascii="Times New Roman" w:hAnsi="Times New Roman" w:cs="Times New Roman"/>
-                <w:sz w:val="26"/>
-                <w:szCs w:val="26"/>
-              </w:rPr>
-            </w:r>
           </w:p>
         </w:tc>
         <w:tc>
@@ -7406,13 +6798,6 @@
                 <w:szCs w:val="26"/>
               </w:rPr>
             </w:pPr>
-            <w:r>
-              <w:rPr>
-                <w:rFonts w:ascii="Times New Roman" w:hAnsi="Times New Roman" w:cs="Times New Roman"/>
-                <w:sz w:val="26"/>
-                <w:szCs w:val="26"/>
-              </w:rPr>
-            </w:r>
           </w:p>
         </w:tc>
         <w:tc>
@@ -7434,13 +6819,6 @@
                 <w:szCs w:val="26"/>
               </w:rPr>
             </w:pPr>
-            <w:r>
-              <w:rPr>
-                <w:rFonts w:ascii="Times New Roman" w:hAnsi="Times New Roman" w:cs="Times New Roman"/>
-                <w:sz w:val="26"/>
-                <w:szCs w:val="26"/>
-              </w:rPr>
-            </w:r>
           </w:p>
         </w:tc>
         <w:tc>
@@ -7462,13 +6840,6 @@
                 <w:szCs w:val="26"/>
               </w:rPr>
             </w:pPr>
-            <w:r>
-              <w:rPr>
-                <w:rFonts w:ascii="Times New Roman" w:hAnsi="Times New Roman" w:cs="Times New Roman"/>
-                <w:sz w:val="26"/>
-                <w:szCs w:val="26"/>
-              </w:rPr>
-            </w:r>
           </w:p>
         </w:tc>
       </w:tr>
@@ -7548,13 +6919,6 @@
                 <w:szCs w:val="26"/>
               </w:rPr>
             </w:pPr>
-            <w:r>
-              <w:rPr>
-                <w:rFonts w:ascii="Times New Roman" w:hAnsi="Times New Roman" w:cs="Times New Roman"/>
-                <w:sz w:val="26"/>
-                <w:szCs w:val="26"/>
-              </w:rPr>
-            </w:r>
           </w:p>
         </w:tc>
         <w:tc>
@@ -7576,13 +6940,6 @@
                 <w:szCs w:val="26"/>
               </w:rPr>
             </w:pPr>
-            <w:r>
-              <w:rPr>
-                <w:rFonts w:ascii="Times New Roman" w:hAnsi="Times New Roman" w:cs="Times New Roman"/>
-                <w:sz w:val="26"/>
-                <w:szCs w:val="26"/>
-              </w:rPr>
-            </w:r>
           </w:p>
         </w:tc>
         <w:tc>
@@ -7604,13 +6961,6 @@
                 <w:szCs w:val="26"/>
               </w:rPr>
             </w:pPr>
-            <w:r>
-              <w:rPr>
-                <w:rFonts w:ascii="Times New Roman" w:hAnsi="Times New Roman" w:cs="Times New Roman"/>
-                <w:sz w:val="26"/>
-                <w:szCs w:val="26"/>
-              </w:rPr>
-            </w:r>
           </w:p>
         </w:tc>
         <w:tc>
@@ -7632,13 +6982,6 @@
                 <w:szCs w:val="26"/>
               </w:rPr>
             </w:pPr>
-            <w:r>
-              <w:rPr>
-                <w:rFonts w:ascii="Times New Roman" w:hAnsi="Times New Roman" w:cs="Times New Roman"/>
-                <w:sz w:val="26"/>
-                <w:szCs w:val="26"/>
-              </w:rPr>
-            </w:r>
           </w:p>
         </w:tc>
         <w:tc>
@@ -7660,13 +7003,6 @@
                 <w:szCs w:val="26"/>
               </w:rPr>
             </w:pPr>
-            <w:r>
-              <w:rPr>
-                <w:rFonts w:ascii="Times New Roman" w:hAnsi="Times New Roman" w:cs="Times New Roman"/>
-                <w:sz w:val="26"/>
-                <w:szCs w:val="26"/>
-              </w:rPr>
-            </w:r>
           </w:p>
         </w:tc>
       </w:tr>
@@ -7746,13 +7082,6 @@
                 <w:szCs w:val="26"/>
               </w:rPr>
             </w:pPr>
-            <w:r>
-              <w:rPr>
-                <w:rFonts w:ascii="Times New Roman" w:hAnsi="Times New Roman" w:cs="Times New Roman"/>
-                <w:sz w:val="26"/>
-                <w:szCs w:val="26"/>
-              </w:rPr>
-            </w:r>
           </w:p>
         </w:tc>
         <w:tc>
@@ -7774,13 +7103,6 @@
                 <w:szCs w:val="26"/>
               </w:rPr>
             </w:pPr>
-            <w:r>
-              <w:rPr>
-                <w:rFonts w:ascii="Times New Roman" w:hAnsi="Times New Roman" w:cs="Times New Roman"/>
-                <w:sz w:val="26"/>
-                <w:szCs w:val="26"/>
-              </w:rPr>
-            </w:r>
           </w:p>
         </w:tc>
         <w:tc>
@@ -7802,13 +7124,6 @@
                 <w:szCs w:val="26"/>
               </w:rPr>
             </w:pPr>
-            <w:r>
-              <w:rPr>
-                <w:rFonts w:ascii="Times New Roman" w:hAnsi="Times New Roman" w:cs="Times New Roman"/>
-                <w:sz w:val="26"/>
-                <w:szCs w:val="26"/>
-              </w:rPr>
-            </w:r>
           </w:p>
         </w:tc>
         <w:tc>
@@ -7830,13 +7145,6 @@
                 <w:szCs w:val="26"/>
               </w:rPr>
             </w:pPr>
-            <w:r>
-              <w:rPr>
-                <w:rFonts w:ascii="Times New Roman" w:hAnsi="Times New Roman" w:cs="Times New Roman"/>
-                <w:sz w:val="26"/>
-                <w:szCs w:val="26"/>
-              </w:rPr>
-            </w:r>
           </w:p>
         </w:tc>
         <w:tc>
@@ -7858,13 +7166,6 @@
                 <w:szCs w:val="26"/>
               </w:rPr>
             </w:pPr>
-            <w:r>
-              <w:rPr>
-                <w:rFonts w:ascii="Times New Roman" w:hAnsi="Times New Roman" w:cs="Times New Roman"/>
-                <w:sz w:val="26"/>
-                <w:szCs w:val="26"/>
-              </w:rPr>
-            </w:r>
           </w:p>
         </w:tc>
       </w:tr>
@@ -7944,12 +7245,6 @@
                 <w:szCs w:val="26"/>
               </w:rPr>
             </w:pPr>
-            <w:r>
-              <w:rPr>
-                <w:rFonts w:ascii="Times New Roman" w:hAnsi="Times New Roman"/>
-                <w:sz w:val="26"/>
-              </w:rPr>
-            </w:r>
           </w:p>
         </w:tc>
         <w:tc>
@@ -7971,12 +7266,6 @@
                 <w:szCs w:val="26"/>
               </w:rPr>
             </w:pPr>
-            <w:r>
-              <w:rPr>
-                <w:rFonts w:ascii="Times New Roman" w:hAnsi="Times New Roman"/>
-                <w:sz w:val="26"/>
-              </w:rPr>
-            </w:r>
           </w:p>
         </w:tc>
         <w:tc>
@@ -7998,12 +7287,6 @@
                 <w:szCs w:val="26"/>
               </w:rPr>
             </w:pPr>
-            <w:r>
-              <w:rPr>
-                <w:rFonts w:ascii="Times New Roman" w:hAnsi="Times New Roman"/>
-                <w:sz w:val="26"/>
-              </w:rPr>
-            </w:r>
           </w:p>
         </w:tc>
         <w:tc>
@@ -8025,12 +7308,6 @@
                 <w:szCs w:val="26"/>
               </w:rPr>
             </w:pPr>
-            <w:r>
-              <w:rPr>
-                <w:rFonts w:ascii="Times New Roman" w:hAnsi="Times New Roman"/>
-                <w:sz w:val="26"/>
-              </w:rPr>
-            </w:r>
           </w:p>
         </w:tc>
         <w:tc>
@@ -8052,12 +7329,6 @@
                 <w:szCs w:val="26"/>
               </w:rPr>
             </w:pPr>
-            <w:r>
-              <w:rPr>
-                <w:rFonts w:ascii="Times New Roman" w:hAnsi="Times New Roman"/>
-                <w:sz w:val="26"/>
-              </w:rPr>
-            </w:r>
           </w:p>
         </w:tc>
       </w:tr>
@@ -8141,12 +7412,6 @@
                 <w:szCs w:val="26"/>
               </w:rPr>
             </w:pPr>
-            <w:r>
-              <w:rPr>
-                <w:rFonts w:ascii="Times New Roman" w:hAnsi="Times New Roman"/>
-                <w:sz w:val="26"/>
-              </w:rPr>
-            </w:r>
           </w:p>
         </w:tc>
         <w:tc>
@@ -8168,12 +7433,6 @@
                 <w:szCs w:val="26"/>
               </w:rPr>
             </w:pPr>
-            <w:r>
-              <w:rPr>
-                <w:rFonts w:ascii="Times New Roman" w:hAnsi="Times New Roman"/>
-                <w:sz w:val="26"/>
-              </w:rPr>
-            </w:r>
           </w:p>
         </w:tc>
         <w:tc>
@@ -8195,12 +7454,6 @@
                 <w:szCs w:val="26"/>
               </w:rPr>
             </w:pPr>
-            <w:r>
-              <w:rPr>
-                <w:rFonts w:ascii="Times New Roman" w:hAnsi="Times New Roman"/>
-                <w:sz w:val="26"/>
-              </w:rPr>
-            </w:r>
           </w:p>
         </w:tc>
         <w:tc>
@@ -8222,12 +7475,6 @@
                 <w:szCs w:val="26"/>
               </w:rPr>
             </w:pPr>
-            <w:r>
-              <w:rPr>
-                <w:rFonts w:ascii="Times New Roman" w:hAnsi="Times New Roman"/>
-                <w:sz w:val="26"/>
-              </w:rPr>
-            </w:r>
           </w:p>
         </w:tc>
         <w:tc>
@@ -8249,12 +7496,6 @@
                 <w:szCs w:val="26"/>
               </w:rPr>
             </w:pPr>
-            <w:r>
-              <w:rPr>
-                <w:rFonts w:ascii="Times New Roman" w:hAnsi="Times New Roman"/>
-                <w:sz w:val="26"/>
-              </w:rPr>
-            </w:r>
           </w:p>
         </w:tc>
       </w:tr>
@@ -8334,12 +7575,6 @@
                 <w:szCs w:val="26"/>
               </w:rPr>
             </w:pPr>
-            <w:r>
-              <w:rPr>
-                <w:rFonts w:ascii="Times New Roman" w:hAnsi="Times New Roman"/>
-                <w:sz w:val="26"/>
-              </w:rPr>
-            </w:r>
           </w:p>
         </w:tc>
         <w:tc>
@@ -8361,12 +7596,6 @@
                 <w:szCs w:val="26"/>
               </w:rPr>
             </w:pPr>
-            <w:r>
-              <w:rPr>
-                <w:rFonts w:ascii="Times New Roman" w:hAnsi="Times New Roman"/>
-                <w:sz w:val="26"/>
-              </w:rPr>
-            </w:r>
           </w:p>
         </w:tc>
         <w:tc>
@@ -8388,12 +7617,6 @@
                 <w:szCs w:val="26"/>
               </w:rPr>
             </w:pPr>
-            <w:r>
-              <w:rPr>
-                <w:rFonts w:ascii="Times New Roman" w:hAnsi="Times New Roman"/>
-                <w:sz w:val="26"/>
-              </w:rPr>
-            </w:r>
           </w:p>
         </w:tc>
         <w:tc>
@@ -8415,12 +7638,6 @@
                 <w:szCs w:val="26"/>
               </w:rPr>
             </w:pPr>
-            <w:r>
-              <w:rPr>
-                <w:rFonts w:ascii="Times New Roman" w:hAnsi="Times New Roman"/>
-                <w:sz w:val="26"/>
-              </w:rPr>
-            </w:r>
           </w:p>
         </w:tc>
         <w:tc>
@@ -8442,12 +7659,6 @@
                 <w:szCs w:val="26"/>
               </w:rPr>
             </w:pPr>
-            <w:r>
-              <w:rPr>
-                <w:rFonts w:ascii="Times New Roman" w:hAnsi="Times New Roman"/>
-                <w:sz w:val="26"/>
-              </w:rPr>
-            </w:r>
           </w:p>
         </w:tc>
       </w:tr>
@@ -8933,12 +8144,6 @@
                 <w:szCs w:val="26"/>
               </w:rPr>
             </w:pPr>
-            <w:r>
-              <w:rPr>
-                <w:rFonts w:ascii="Times New Roman" w:hAnsi="Times New Roman"/>
-                <w:sz w:val="26"/>
-              </w:rPr>
-            </w:r>
           </w:p>
         </w:tc>
         <w:tc>
@@ -8960,12 +8165,6 @@
                 <w:szCs w:val="26"/>
               </w:rPr>
             </w:pPr>
-            <w:r>
-              <w:rPr>
-                <w:rFonts w:ascii="Times New Roman" w:hAnsi="Times New Roman"/>
-                <w:sz w:val="26"/>
-              </w:rPr>
-            </w:r>
           </w:p>
         </w:tc>
         <w:tc>
@@ -8987,12 +8186,6 @@
                 <w:szCs w:val="26"/>
               </w:rPr>
             </w:pPr>
-            <w:r>
-              <w:rPr>
-                <w:rFonts w:ascii="Times New Roman" w:hAnsi="Times New Roman"/>
-                <w:sz w:val="26"/>
-              </w:rPr>
-            </w:r>
           </w:p>
         </w:tc>
         <w:tc>
@@ -9014,12 +8207,6 @@
                 <w:szCs w:val="26"/>
               </w:rPr>
             </w:pPr>
-            <w:r>
-              <w:rPr>
-                <w:rFonts w:ascii="Times New Roman" w:hAnsi="Times New Roman"/>
-                <w:sz w:val="26"/>
-              </w:rPr>
-            </w:r>
           </w:p>
         </w:tc>
         <w:tc>
@@ -9041,12 +8228,6 @@
                 <w:szCs w:val="26"/>
               </w:rPr>
             </w:pPr>
-            <w:r>
-              <w:rPr>
-                <w:rFonts w:ascii="Times New Roman" w:hAnsi="Times New Roman"/>
-                <w:sz w:val="26"/>
-              </w:rPr>
-            </w:r>
           </w:p>
         </w:tc>
       </w:tr>
@@ -9942,12 +9123,6 @@
                 <w:szCs w:val="26"/>
               </w:rPr>
             </w:pPr>
-            <w:r>
-              <w:rPr>
-                <w:rFonts w:ascii="Times New Roman" w:hAnsi="Times New Roman"/>
-                <w:sz w:val="26"/>
-              </w:rPr>
-            </w:r>
           </w:p>
         </w:tc>
         <w:tc>
@@ -9969,12 +9144,6 @@
                 <w:szCs w:val="26"/>
               </w:rPr>
             </w:pPr>
-            <w:r>
-              <w:rPr>
-                <w:rFonts w:ascii="Times New Roman" w:hAnsi="Times New Roman"/>
-                <w:sz w:val="26"/>
-              </w:rPr>
-            </w:r>
           </w:p>
         </w:tc>
         <w:tc>
@@ -9996,12 +9165,6 @@
                 <w:szCs w:val="26"/>
               </w:rPr>
             </w:pPr>
-            <w:r>
-              <w:rPr>
-                <w:rFonts w:ascii="Times New Roman" w:hAnsi="Times New Roman"/>
-                <w:sz w:val="26"/>
-              </w:rPr>
-            </w:r>
           </w:p>
         </w:tc>
         <w:tc>
@@ -10023,12 +9186,6 @@
                 <w:szCs w:val="26"/>
               </w:rPr>
             </w:pPr>
-            <w:r>
-              <w:rPr>
-                <w:rFonts w:ascii="Times New Roman" w:hAnsi="Times New Roman"/>
-                <w:sz w:val="26"/>
-              </w:rPr>
-            </w:r>
           </w:p>
         </w:tc>
         <w:tc>
@@ -10050,12 +9207,6 @@
                 <w:szCs w:val="26"/>
               </w:rPr>
             </w:pPr>
-            <w:r>
-              <w:rPr>
-                <w:rFonts w:ascii="Times New Roman" w:hAnsi="Times New Roman"/>
-                <w:sz w:val="26"/>
-              </w:rPr>
-            </w:r>
           </w:p>
         </w:tc>
       </w:tr>
@@ -10139,13 +9290,6 @@
                 <w:szCs w:val="26"/>
               </w:rPr>
             </w:pPr>
-            <w:r>
-              <w:rPr>
-                <w:rFonts w:ascii="Times New Roman" w:hAnsi="Times New Roman" w:cs="Times New Roman"/>
-                <w:sz w:val="26"/>
-                <w:szCs w:val="26"/>
-              </w:rPr>
-            </w:r>
           </w:p>
         </w:tc>
         <w:tc>
@@ -10167,13 +9311,6 @@
                 <w:szCs w:val="26"/>
               </w:rPr>
             </w:pPr>
-            <w:r>
-              <w:rPr>
-                <w:rFonts w:ascii="Times New Roman" w:hAnsi="Times New Roman" w:cs="Times New Roman"/>
-                <w:sz w:val="26"/>
-                <w:szCs w:val="26"/>
-              </w:rPr>
-            </w:r>
           </w:p>
         </w:tc>
         <w:tc>
@@ -10195,13 +9332,6 @@
                 <w:szCs w:val="26"/>
               </w:rPr>
             </w:pPr>
-            <w:r>
-              <w:rPr>
-                <w:rFonts w:ascii="Times New Roman" w:hAnsi="Times New Roman" w:cs="Times New Roman"/>
-                <w:sz w:val="26"/>
-                <w:szCs w:val="26"/>
-              </w:rPr>
-            </w:r>
           </w:p>
         </w:tc>
         <w:tc>
@@ -10223,13 +9353,6 @@
                 <w:szCs w:val="26"/>
               </w:rPr>
             </w:pPr>
-            <w:r>
-              <w:rPr>
-                <w:rFonts w:ascii="Times New Roman" w:hAnsi="Times New Roman" w:cs="Times New Roman"/>
-                <w:sz w:val="26"/>
-                <w:szCs w:val="26"/>
-              </w:rPr>
-            </w:r>
           </w:p>
         </w:tc>
         <w:tc>
@@ -10251,13 +9374,6 @@
                 <w:szCs w:val="26"/>
               </w:rPr>
             </w:pPr>
-            <w:r>
-              <w:rPr>
-                <w:rFonts w:ascii="Times New Roman" w:hAnsi="Times New Roman" w:cs="Times New Roman"/>
-                <w:sz w:val="26"/>
-                <w:szCs w:val="26"/>
-              </w:rPr>
-            </w:r>
           </w:p>
         </w:tc>
       </w:tr>
@@ -10334,13 +9450,6 @@
                 <w:szCs w:val="26"/>
               </w:rPr>
             </w:pPr>
-            <w:r>
-              <w:rPr>
-                <w:rFonts w:ascii="Times New Roman" w:hAnsi="Times New Roman" w:cs="Times New Roman"/>
-                <w:sz w:val="26"/>
-                <w:szCs w:val="26"/>
-              </w:rPr>
-            </w:r>
           </w:p>
         </w:tc>
         <w:tc>
@@ -10362,13 +9471,6 @@
                 <w:szCs w:val="26"/>
               </w:rPr>
             </w:pPr>
-            <w:r>
-              <w:rPr>
-                <w:rFonts w:ascii="Times New Roman" w:hAnsi="Times New Roman" w:cs="Times New Roman"/>
-                <w:sz w:val="26"/>
-                <w:szCs w:val="26"/>
-              </w:rPr>
-            </w:r>
           </w:p>
         </w:tc>
         <w:tc>
@@ -10390,13 +9492,6 @@
                 <w:szCs w:val="26"/>
               </w:rPr>
             </w:pPr>
-            <w:r>
-              <w:rPr>
-                <w:rFonts w:ascii="Times New Roman" w:hAnsi="Times New Roman" w:cs="Times New Roman"/>
-                <w:sz w:val="26"/>
-                <w:szCs w:val="26"/>
-              </w:rPr>
-            </w:r>
           </w:p>
         </w:tc>
         <w:tc>
@@ -10418,13 +9513,6 @@
                 <w:szCs w:val="26"/>
               </w:rPr>
             </w:pPr>
-            <w:r>
-              <w:rPr>
-                <w:rFonts w:ascii="Times New Roman" w:hAnsi="Times New Roman" w:cs="Times New Roman"/>
-                <w:sz w:val="26"/>
-                <w:szCs w:val="26"/>
-              </w:rPr>
-            </w:r>
           </w:p>
         </w:tc>
         <w:tc>
@@ -10446,13 +9534,6 @@
                 <w:szCs w:val="26"/>
               </w:rPr>
             </w:pPr>
-            <w:r>
-              <w:rPr>
-                <w:rFonts w:ascii="Times New Roman" w:hAnsi="Times New Roman" w:cs="Times New Roman"/>
-                <w:sz w:val="26"/>
-                <w:szCs w:val="26"/>
-              </w:rPr>
-            </w:r>
           </w:p>
         </w:tc>
       </w:tr>
@@ -10729,12 +9810,6 @@
                 <w:szCs w:val="26"/>
               </w:rPr>
             </w:pPr>
-            <w:r>
-              <w:rPr>
-                <w:rFonts w:ascii="Times New Roman" w:hAnsi="Times New Roman"/>
-                <w:sz w:val="26"/>
-              </w:rPr>
-            </w:r>
           </w:p>
         </w:tc>
         <w:tc>
@@ -10756,12 +9831,6 @@
                 <w:szCs w:val="26"/>
               </w:rPr>
             </w:pPr>
-            <w:r>
-              <w:rPr>
-                <w:rFonts w:ascii="Times New Roman" w:hAnsi="Times New Roman"/>
-                <w:sz w:val="26"/>
-              </w:rPr>
-            </w:r>
           </w:p>
         </w:tc>
         <w:tc>
@@ -10783,12 +9852,6 @@
                 <w:szCs w:val="26"/>
               </w:rPr>
             </w:pPr>
-            <w:r>
-              <w:rPr>
-                <w:rFonts w:ascii="Times New Roman" w:hAnsi="Times New Roman"/>
-                <w:sz w:val="26"/>
-              </w:rPr>
-            </w:r>
           </w:p>
         </w:tc>
         <w:tc>
@@ -10810,12 +9873,6 @@
                 <w:szCs w:val="26"/>
               </w:rPr>
             </w:pPr>
-            <w:r>
-              <w:rPr>
-                <w:rFonts w:ascii="Times New Roman" w:hAnsi="Times New Roman"/>
-                <w:sz w:val="26"/>
-              </w:rPr>
-            </w:r>
           </w:p>
         </w:tc>
         <w:tc>
@@ -10837,12 +9894,6 @@
                 <w:szCs w:val="26"/>
               </w:rPr>
             </w:pPr>
-            <w:r>
-              <w:rPr>
-                <w:rFonts w:ascii="Times New Roman" w:hAnsi="Times New Roman"/>
-                <w:sz w:val="26"/>
-              </w:rPr>
-            </w:r>
           </w:p>
         </w:tc>
       </w:tr>
@@ -10919,12 +9970,6 @@
                 <w:szCs w:val="26"/>
               </w:rPr>
             </w:pPr>
-            <w:r>
-              <w:rPr>
-                <w:rFonts w:ascii="Times New Roman" w:hAnsi="Times New Roman"/>
-                <w:sz w:val="26"/>
-              </w:rPr>
-            </w:r>
           </w:p>
         </w:tc>
         <w:tc>
@@ -10946,12 +9991,6 @@
                 <w:szCs w:val="26"/>
               </w:rPr>
             </w:pPr>
-            <w:r>
-              <w:rPr>
-                <w:rFonts w:ascii="Times New Roman" w:hAnsi="Times New Roman"/>
-                <w:sz w:val="26"/>
-              </w:rPr>
-            </w:r>
           </w:p>
         </w:tc>
         <w:tc>
@@ -10973,12 +10012,6 @@
                 <w:szCs w:val="26"/>
               </w:rPr>
             </w:pPr>
-            <w:r>
-              <w:rPr>
-                <w:rFonts w:ascii="Times New Roman" w:hAnsi="Times New Roman"/>
-                <w:sz w:val="26"/>
-              </w:rPr>
-            </w:r>
           </w:p>
         </w:tc>
         <w:tc>
@@ -11000,12 +10033,6 @@
                 <w:szCs w:val="26"/>
               </w:rPr>
             </w:pPr>
-            <w:r>
-              <w:rPr>
-                <w:rFonts w:ascii="Times New Roman" w:hAnsi="Times New Roman"/>
-                <w:sz w:val="26"/>
-              </w:rPr>
-            </w:r>
           </w:p>
         </w:tc>
         <w:tc>
@@ -11027,12 +10054,6 @@
                 <w:szCs w:val="26"/>
               </w:rPr>
             </w:pPr>
-            <w:r>
-              <w:rPr>
-                <w:rFonts w:ascii="Times New Roman" w:hAnsi="Times New Roman"/>
-                <w:sz w:val="26"/>
-              </w:rPr>
-            </w:r>
           </w:p>
         </w:tc>
       </w:tr>
@@ -11222,6 +10243,7 @@
           <w:color w:val="000000"/>
           <w:szCs w:val="28"/>
         </w:rPr>
+        <w:lastRenderedPageBreak/>
         <w:t>Nhận xét của BGH hoặc tổ trưởng chuyên môn về tiến độ thực hiện chương trình</w:t>
       </w:r>
     </w:p>

</xml_diff>